<commit_message>
fix: confere o SHA-256 da foto na leitura (RNF06) e documenta o atendimento dos RNFs
- obter_foto recusa entregar arquivo alterado no banco, com teste
- arquitetura: seção 10 com RNF01 a RNF07 e divergências, linha de LGPD na segurança
- contrato da API: código 500 de arquivo que não confere
- suítes refeitas em SQLite e PostgreSQL (123 execuções, 0 falhas, 2 pulados)
</commit_message>
<xml_diff>
--- a/docs/arquitetura/Arquitetura_do_Sistema_SIGA_UEA.docx
+++ b/docs/arquitetura/Arquitetura_do_Sistema_SIGA_UEA.docx
@@ -732,7 +732,7 @@
           <w:color w:val="000000"/>
           <w:sz w:val="22"/>
         </w:rPr>
-        <w:t>10. VERIFICAÇÃO DA ARQUITETURA</w:t>
+        <w:t>10. ATENDIMENTO AOS REQUISITOS NÃO FUNCIONAIS</w:t>
         <w:tab/>
         <w:t>7</w:t>
       </w:r>
@@ -752,7 +752,7 @@
           <w:color w:val="000000"/>
           <w:sz w:val="22"/>
         </w:rPr>
-        <w:t>11. REGISTRO DE ALTERAÇÕES</w:t>
+        <w:t>11. VERIFICAÇÃO DA ARQUITETURA</w:t>
         <w:tab/>
         <w:t>8</w:t>
       </w:r>
@@ -772,9 +772,9 @@
           <w:color w:val="000000"/>
           <w:sz w:val="22"/>
         </w:rPr>
-        <w:t>12. APROVAÇÕES</w:t>
+        <w:t>12. REGISTRO DE ALTERAÇÕES</w:t>
         <w:tab/>
-        <w:t>8</w:t>
+        <w:t>9</w:t>
       </w:r>
     </w:p>
     <w:p>
@@ -792,9 +792,29 @@
           <w:color w:val="000000"/>
           <w:sz w:val="22"/>
         </w:rPr>
-        <w:t>13. REFERÊNCIAS</w:t>
+        <w:t>13. APROVAÇÕES</w:t>
         <w:tab/>
-        <w:t>8</w:t>
+        <w:t>9</w:t>
+      </w:r>
+    </w:p>
+    <w:p>
+      <w:pPr>
+        <w:tabs>
+          <w:tab w:pos="9071" w:val="right" w:leader="dot"/>
+        </w:tabs>
+        <w:spacing w:before="0" w:after="60" w:line="260" w:lineRule="auto"/>
+        <w:ind w:left="0"/>
+      </w:pPr>
+      <w:r>
+        <w:rPr>
+          <w:rFonts w:ascii="Arial" w:hAnsi="Arial" w:eastAsia="Arial" w:cs="Arial"/>
+          <w:b/>
+          <w:color w:val="000000"/>
+          <w:sz w:val="22"/>
+        </w:rPr>
+        <w:t>14. REFERÊNCIAS</w:t>
+        <w:tab/>
+        <w:t>9</w:t>
       </w:r>
     </w:p>
     <w:p>
@@ -3787,6 +3807,61 @@
                 <w:sz w:val="20"/>
               </w:rPr>
               <w:t>Log de auditoria com gatilho no banco que recusa UPDATE e DELETE (migração 0003, RNF03).</w:t>
+            </w:r>
+          </w:p>
+        </w:tc>
+      </w:tr>
+      <w:tr>
+        <w:trPr>
+          <w:cantSplit w:val="1"/>
+        </w:trPr>
+        <w:tc>
+          <w:tcPr>
+            <w:tcW w:type="dxa" w:w="2835"/>
+            <w:tcMar>
+              <w:top w:w="60" w:type="dxa"/>
+              <w:left w:w="100" w:type="dxa"/>
+              <w:bottom w:w="60" w:type="dxa"/>
+              <w:right w:w="100" w:type="dxa"/>
+            </w:tcMar>
+          </w:tcPr>
+          <w:p>
+            <w:pPr>
+              <w:spacing w:before="0" w:after="40" w:line="260" w:lineRule="auto"/>
+            </w:pPr>
+            <w:r>
+              <w:rPr>
+                <w:rFonts w:ascii="Arial" w:hAnsi="Arial" w:eastAsia="Arial" w:cs="Arial"/>
+                <w:b w:val="0"/>
+                <w:color w:val="000000"/>
+                <w:sz w:val="20"/>
+              </w:rPr>
+              <w:t>Dados pessoais (LGPD)</w:t>
+            </w:r>
+          </w:p>
+        </w:tc>
+        <w:tc>
+          <w:tcPr>
+            <w:tcW w:type="dxa" w:w="6236"/>
+            <w:tcMar>
+              <w:top w:w="60" w:type="dxa"/>
+              <w:left w:w="100" w:type="dxa"/>
+              <w:bottom w:w="60" w:type="dxa"/>
+              <w:right w:w="100" w:type="dxa"/>
+            </w:tcMar>
+          </w:tcPr>
+          <w:p>
+            <w:pPr>
+              <w:spacing w:before="0" w:after="40" w:line="260" w:lineRule="auto"/>
+            </w:pPr>
+            <w:r>
+              <w:rPr>
+                <w:rFonts w:ascii="Arial" w:hAnsi="Arial" w:eastAsia="Arial" w:cs="Arial"/>
+                <w:b w:val="0"/>
+                <w:color w:val="000000"/>
+                <w:sz w:val="20"/>
+              </w:rPr>
+              <w:t>Cada perfil vê só o que precisa (RN07), os testes usam dados fictícios e as alterações ficam auditadas. Não se presume conformidade jurídica certificada (risco R08).</w:t>
             </w:r>
           </w:p>
         </w:tc>
@@ -5018,16 +5093,12 @@
           <w:color w:val="000000"/>
           <w:sz w:val="30"/>
         </w:rPr>
-        <w:t>10. VERIFICAÇÃO DA ARQUITETURA</w:t>
-      </w:r>
-    </w:p>
-    <w:p>
-      <w:pPr>
-        <w:tabs>
-          <w:tab w:pos="510" w:val="left"/>
-        </w:tabs>
-        <w:spacing w:before="0" w:after="80" w:line="276" w:lineRule="auto"/>
-        <w:ind w:left="510" w:hanging="340"/>
+        <w:t>10. ATENDIMENTO AOS REQUISITOS NÃO FUNCIONAIS</w:t>
+      </w:r>
+    </w:p>
+    <w:p>
+      <w:pPr>
+        <w:spacing w:before="0" w:after="120" w:line="276" w:lineRule="auto"/>
         <w:jc w:val="both"/>
       </w:pPr>
       <w:r>
@@ -5037,120 +5108,7 @@
           <w:color w:val="000000"/>
           <w:sz w:val="22"/>
         </w:rPr>
-        <w:t>•</w:t>
-        <w:tab/>
-      </w:r>
-      <w:r>
-        <w:rPr>
-          <w:rFonts w:ascii="Arial" w:hAnsi="Arial" w:eastAsia="Arial" w:cs="Arial"/>
-          <w:b w:val="0"/>
-          <w:color w:val="000000"/>
-          <w:sz w:val="22"/>
-        </w:rPr>
-        <w:t>Suíte da API (backend/tests, pytest): 122 execuções em SQLite e em PostgreSQL 16, cobrindo as 51 operações do contrato.</w:t>
-      </w:r>
-    </w:p>
-    <w:p>
-      <w:pPr>
-        <w:tabs>
-          <w:tab w:pos="510" w:val="left"/>
-        </w:tabs>
-        <w:spacing w:before="0" w:after="80" w:line="276" w:lineRule="auto"/>
-        <w:ind w:left="510" w:hanging="340"/>
-        <w:jc w:val="both"/>
-      </w:pPr>
-      <w:r>
-        <w:rPr>
-          <w:rFonts w:ascii="Arial" w:hAnsi="Arial" w:eastAsia="Arial" w:cs="Arial"/>
-          <w:b w:val="0"/>
-          <w:color w:val="000000"/>
-          <w:sz w:val="22"/>
-        </w:rPr>
-        <w:t>•</w:t>
-        <w:tab/>
-      </w:r>
-      <w:r>
-        <w:rPr>
-          <w:rFonts w:ascii="Arial" w:hAnsi="Arial" w:eastAsia="Arial" w:cs="Arial"/>
-          <w:b w:val="0"/>
-          <w:color w:val="000000"/>
-          <w:sz w:val="22"/>
-        </w:rPr>
-        <w:t>Testes no navegador (docs/testes/e2e): fluxos completos pela tela e responsividade em 360 e 768 px.</w:t>
-      </w:r>
-    </w:p>
-    <w:p>
-      <w:pPr>
-        <w:tabs>
-          <w:tab w:pos="510" w:val="left"/>
-        </w:tabs>
-        <w:spacing w:before="0" w:after="80" w:line="276" w:lineRule="auto"/>
-        <w:ind w:left="510" w:hanging="340"/>
-        <w:jc w:val="both"/>
-      </w:pPr>
-      <w:r>
-        <w:rPr>
-          <w:rFonts w:ascii="Arial" w:hAnsi="Arial" w:eastAsia="Arial" w:cs="Arial"/>
-          <w:b w:val="0"/>
-          <w:color w:val="000000"/>
-          <w:sz w:val="22"/>
-        </w:rPr>
-        <w:t>•</w:t>
-        <w:tab/>
-      </w:r>
-      <w:r>
-        <w:rPr>
-          <w:rFonts w:ascii="Arial" w:hAnsi="Arial" w:eastAsia="Arial" w:cs="Arial"/>
-          <w:b w:val="0"/>
-          <w:color w:val="000000"/>
-          <w:sz w:val="22"/>
-        </w:rPr>
-        <w:t>Teste de carga (backend/scripts/carga_rnf01.py): RNF01 e RNF06.</w:t>
-      </w:r>
-    </w:p>
-    <w:p>
-      <w:pPr>
-        <w:tabs>
-          <w:tab w:pos="510" w:val="left"/>
-        </w:tabs>
-        <w:spacing w:before="0" w:after="80" w:line="276" w:lineRule="auto"/>
-        <w:ind w:left="510" w:hanging="340"/>
-        <w:jc w:val="both"/>
-      </w:pPr>
-      <w:r>
-        <w:rPr>
-          <w:rFonts w:ascii="Arial" w:hAnsi="Arial" w:eastAsia="Arial" w:cs="Arial"/>
-          <w:b w:val="0"/>
-          <w:color w:val="000000"/>
-          <w:sz w:val="22"/>
-        </w:rPr>
-        <w:t>•</w:t>
-        <w:tab/>
-      </w:r>
-      <w:r>
-        <w:rPr>
-          <w:rFonts w:ascii="Arial" w:hAnsi="Arial" w:eastAsia="Arial" w:cs="Arial"/>
-          <w:b w:val="0"/>
-          <w:color w:val="000000"/>
-          <w:sz w:val="22"/>
-        </w:rPr>
-        <w:t>Resultados e evidências: Relatório de Execução de Testes (pasta 07_Testes).</w:t>
-      </w:r>
-    </w:p>
-    <w:p>
-      <w:pPr>
-        <w:pStyle w:val="Heading1"/>
-        <w:keepNext/>
-        <w:spacing w:before="360" w:after="200"/>
-      </w:pPr>
-      <w:r>
-        <w:rPr>
-          <w:rFonts w:ascii="Arial" w:hAnsi="Arial" w:eastAsia="Arial" w:cs="Arial"/>
-          <w:b/>
-          <w:color w:val="000000"/>
-          <w:sz w:val="30"/>
-        </w:rPr>
-        <w:t>11. REGISTRO DE ALTERAÇÕES</w:t>
+        <w:t>A tabela compara cada requisito não funcional da planilha Requisitos_SIGA_UEA.xlsx com o que o sistema faz em 20/10/2026. Atendido: cumprido e verificado; Parcial: parte cumprida e parte pendente; Planejado: depende de um módulo ou do ambiente ainda não entregue.</w:t>
       </w:r>
     </w:p>
     <w:tbl>
@@ -5180,7 +5138,7 @@
         </w:trPr>
         <w:tc>
           <w:tcPr>
-            <w:tcW w:type="dxa" w:w="1020"/>
+            <w:tcW w:type="dxa" w:w="907"/>
             <w:shd w:val="clear" w:fill="000000"/>
             <w:tcMar>
               <w:top w:w="60" w:type="dxa"/>
@@ -5200,13 +5158,13 @@
                 <w:color w:val="FFFFFF"/>
                 <w:sz w:val="20"/>
               </w:rPr>
-              <w:t>Versão</w:t>
-            </w:r>
-          </w:p>
-        </w:tc>
-        <w:tc>
-          <w:tcPr>
-            <w:tcW w:type="dxa" w:w="1361"/>
+              <w:t>RNF</w:t>
+            </w:r>
+          </w:p>
+        </w:tc>
+        <w:tc>
+          <w:tcPr>
+            <w:tcW w:type="dxa" w:w="2608"/>
             <w:shd w:val="clear" w:fill="000000"/>
             <w:tcMar>
               <w:top w:w="60" w:type="dxa"/>
@@ -5226,13 +5184,13 @@
                 <w:color w:val="FFFFFF"/>
                 <w:sz w:val="20"/>
               </w:rPr>
-              <w:t>Data</w:t>
-            </w:r>
-          </w:p>
-        </w:tc>
-        <w:tc>
-          <w:tcPr>
-            <w:tcW w:type="dxa" w:w="4989"/>
+              <w:t>O que a planilha exige</w:t>
+            </w:r>
+          </w:p>
+        </w:tc>
+        <w:tc>
+          <w:tcPr>
+            <w:tcW w:type="dxa" w:w="3628"/>
             <w:shd w:val="clear" w:fill="000000"/>
             <w:tcMar>
               <w:top w:w="60" w:type="dxa"/>
@@ -5252,13 +5210,13 @@
                 <w:color w:val="FFFFFF"/>
                 <w:sz w:val="20"/>
               </w:rPr>
-              <w:t>Descrição</w:t>
-            </w:r>
-          </w:p>
-        </w:tc>
-        <w:tc>
-          <w:tcPr>
-            <w:tcW w:type="dxa" w:w="1701"/>
+              <w:t>Como o sistema atende</w:t>
+            </w:r>
+          </w:p>
+        </w:tc>
+        <w:tc>
+          <w:tcPr>
+            <w:tcW w:type="dxa" w:w="1928"/>
             <w:shd w:val="clear" w:fill="000000"/>
             <w:tcMar>
               <w:top w:w="60" w:type="dxa"/>
@@ -5278,7 +5236,7 @@
                 <w:color w:val="FFFFFF"/>
                 <w:sz w:val="20"/>
               </w:rPr>
-              <w:t>Responsável</w:t>
+              <w:t>Situação</w:t>
             </w:r>
           </w:p>
         </w:tc>
@@ -5289,101 +5247,731 @@
         </w:trPr>
         <w:tc>
           <w:tcPr>
-            <w:tcW w:type="dxa" w:w="1020"/>
-            <w:tcMar>
-              <w:top w:w="60" w:type="dxa"/>
-              <w:left w:w="100" w:type="dxa"/>
-              <w:bottom w:w="60" w:type="dxa"/>
-              <w:right w:w="100" w:type="dxa"/>
-            </w:tcMar>
-          </w:tcPr>
-          <w:p>
-            <w:pPr>
-              <w:spacing w:before="0" w:after="40" w:line="260" w:lineRule="auto"/>
-            </w:pPr>
-            <w:r>
-              <w:rPr>
-                <w:rFonts w:ascii="Arial" w:hAnsi="Arial" w:eastAsia="Arial" w:cs="Arial"/>
-                <w:b w:val="0"/>
-                <w:color w:val="000000"/>
-                <w:sz w:val="20"/>
-              </w:rPr>
-              <w:t>1.0</w:t>
-            </w:r>
-          </w:p>
-        </w:tc>
-        <w:tc>
-          <w:tcPr>
-            <w:tcW w:type="dxa" w:w="1361"/>
-            <w:tcMar>
-              <w:top w:w="60" w:type="dxa"/>
-              <w:left w:w="100" w:type="dxa"/>
-              <w:bottom w:w="60" w:type="dxa"/>
-              <w:right w:w="100" w:type="dxa"/>
-            </w:tcMar>
-          </w:tcPr>
-          <w:p>
-            <w:pPr>
-              <w:spacing w:before="0" w:after="40" w:line="260" w:lineRule="auto"/>
-            </w:pPr>
-            <w:r>
-              <w:rPr>
-                <w:rFonts w:ascii="Arial" w:hAnsi="Arial" w:eastAsia="Arial" w:cs="Arial"/>
-                <w:b w:val="0"/>
-                <w:color w:val="000000"/>
-                <w:sz w:val="20"/>
-              </w:rPr>
-              <w:t>20/10/2026</w:t>
-            </w:r>
-          </w:p>
-        </w:tc>
-        <w:tc>
-          <w:tcPr>
-            <w:tcW w:type="dxa" w:w="4989"/>
-            <w:tcMar>
-              <w:top w:w="60" w:type="dxa"/>
-              <w:left w:w="100" w:type="dxa"/>
-              <w:bottom w:w="60" w:type="dxa"/>
-              <w:right w:w="100" w:type="dxa"/>
-            </w:tcMar>
-          </w:tcPr>
-          <w:p>
-            <w:pPr>
-              <w:spacing w:before="0" w:after="40" w:line="260" w:lineRule="auto"/>
-            </w:pPr>
-            <w:r>
-              <w:rPr>
-                <w:rFonts w:ascii="Arial" w:hAnsi="Arial" w:eastAsia="Arial" w:cs="Arial"/>
-                <w:b w:val="0"/>
-                <w:color w:val="000000"/>
-                <w:sz w:val="20"/>
-              </w:rPr>
-              <w:t>Criação do documento.</w:t>
-            </w:r>
-          </w:p>
-        </w:tc>
-        <w:tc>
-          <w:tcPr>
-            <w:tcW w:type="dxa" w:w="1701"/>
-            <w:tcMar>
-              <w:top w:w="60" w:type="dxa"/>
-              <w:left w:w="100" w:type="dxa"/>
-              <w:bottom w:w="60" w:type="dxa"/>
-              <w:right w:w="100" w:type="dxa"/>
-            </w:tcMar>
-          </w:tcPr>
-          <w:p>
-            <w:pPr>
-              <w:spacing w:before="0" w:after="40" w:line="260" w:lineRule="auto"/>
-            </w:pPr>
-            <w:r>
-              <w:rPr>
-                <w:rFonts w:ascii="Arial" w:hAnsi="Arial" w:eastAsia="Arial" w:cs="Arial"/>
-                <w:b w:val="0"/>
-                <w:color w:val="000000"/>
-                <w:sz w:val="20"/>
-              </w:rPr>
-              <w:t>Igor Leite</w:t>
+            <w:tcW w:type="dxa" w:w="907"/>
+            <w:tcMar>
+              <w:top w:w="60" w:type="dxa"/>
+              <w:left w:w="100" w:type="dxa"/>
+              <w:bottom w:w="60" w:type="dxa"/>
+              <w:right w:w="100" w:type="dxa"/>
+            </w:tcMar>
+          </w:tcPr>
+          <w:p>
+            <w:pPr>
+              <w:spacing w:before="0" w:after="40" w:line="260" w:lineRule="auto"/>
+            </w:pPr>
+            <w:r>
+              <w:rPr>
+                <w:rFonts w:ascii="Arial" w:hAnsi="Arial" w:eastAsia="Arial" w:cs="Arial"/>
+                <w:b w:val="0"/>
+                <w:color w:val="000000"/>
+                <w:sz w:val="20"/>
+              </w:rPr>
+              <w:t>RNF01</w:t>
+            </w:r>
+          </w:p>
+        </w:tc>
+        <w:tc>
+          <w:tcPr>
+            <w:tcW w:type="dxa" w:w="2608"/>
+            <w:tcMar>
+              <w:top w:w="60" w:type="dxa"/>
+              <w:left w:w="100" w:type="dxa"/>
+              <w:bottom w:w="60" w:type="dxa"/>
+              <w:right w:w="100" w:type="dxa"/>
+            </w:tcMar>
+          </w:tcPr>
+          <w:p>
+            <w:pPr>
+              <w:spacing w:before="0" w:after="40" w:line="260" w:lineRule="auto"/>
+            </w:pPr>
+            <w:r>
+              <w:rPr>
+                <w:rFonts w:ascii="Arial" w:hAnsi="Arial" w:eastAsia="Arial" w:cs="Arial"/>
+                <w:b w:val="0"/>
+                <w:color w:val="000000"/>
+                <w:sz w:val="20"/>
+              </w:rPr>
+              <w:t>Submissão do cadastro em até 3 s (p95) com 30 envios simultâneos.</w:t>
+            </w:r>
+          </w:p>
+        </w:tc>
+        <w:tc>
+          <w:tcPr>
+            <w:tcW w:type="dxa" w:w="3628"/>
+            <w:tcMar>
+              <w:top w:w="60" w:type="dxa"/>
+              <w:left w:w="100" w:type="dxa"/>
+              <w:bottom w:w="60" w:type="dxa"/>
+              <w:right w:w="100" w:type="dxa"/>
+            </w:tcMar>
+          </w:tcPr>
+          <w:p>
+            <w:pPr>
+              <w:spacing w:before="0" w:after="40" w:line="260" w:lineRule="auto"/>
+            </w:pPr>
+            <w:r>
+              <w:rPr>
+                <w:rFonts w:ascii="Arial" w:hAnsi="Arial" w:eastAsia="Arial" w:cs="Arial"/>
+                <w:b w:val="0"/>
+                <w:color w:val="000000"/>
+                <w:sz w:val="20"/>
+              </w:rPr>
+              <w:t>Trava de linha, transação curta e e-mail depois da resposta. Medido: p95 de 0,73 s com 30 envios, em PostgreSQL 16 local.</w:t>
+            </w:r>
+          </w:p>
+        </w:tc>
+        <w:tc>
+          <w:tcPr>
+            <w:tcW w:type="dxa" w:w="1928"/>
+            <w:tcMar>
+              <w:top w:w="60" w:type="dxa"/>
+              <w:left w:w="100" w:type="dxa"/>
+              <w:bottom w:w="60" w:type="dxa"/>
+              <w:right w:w="100" w:type="dxa"/>
+            </w:tcMar>
+          </w:tcPr>
+          <w:p>
+            <w:pPr>
+              <w:spacing w:before="0" w:after="40" w:line="260" w:lineRule="auto"/>
+            </w:pPr>
+            <w:r>
+              <w:rPr>
+                <w:rFonts w:ascii="Arial" w:hAnsi="Arial" w:eastAsia="Arial" w:cs="Arial"/>
+                <w:b w:val="0"/>
+                <w:color w:val="000000"/>
+                <w:sz w:val="20"/>
+              </w:rPr>
+              <w:t>Atendido localmente; repetir no ambiente integrado</w:t>
+            </w:r>
+          </w:p>
+        </w:tc>
+      </w:tr>
+      <w:tr>
+        <w:trPr>
+          <w:cantSplit w:val="1"/>
+        </w:trPr>
+        <w:tc>
+          <w:tcPr>
+            <w:tcW w:type="dxa" w:w="907"/>
+            <w:tcMar>
+              <w:top w:w="60" w:type="dxa"/>
+              <w:left w:w="100" w:type="dxa"/>
+              <w:bottom w:w="60" w:type="dxa"/>
+              <w:right w:w="100" w:type="dxa"/>
+            </w:tcMar>
+          </w:tcPr>
+          <w:p>
+            <w:pPr>
+              <w:spacing w:before="0" w:after="40" w:line="260" w:lineRule="auto"/>
+            </w:pPr>
+            <w:r>
+              <w:rPr>
+                <w:rFonts w:ascii="Arial" w:hAnsi="Arial" w:eastAsia="Arial" w:cs="Arial"/>
+                <w:b w:val="0"/>
+                <w:color w:val="000000"/>
+                <w:sz w:val="20"/>
+              </w:rPr>
+              <w:t>RNF02</w:t>
+            </w:r>
+          </w:p>
+        </w:tc>
+        <w:tc>
+          <w:tcPr>
+            <w:tcW w:type="dxa" w:w="2608"/>
+            <w:tcMar>
+              <w:top w:w="60" w:type="dxa"/>
+              <w:left w:w="100" w:type="dxa"/>
+              <w:bottom w:w="60" w:type="dxa"/>
+              <w:right w:w="100" w:type="dxa"/>
+            </w:tcMar>
+          </w:tcPr>
+          <w:p>
+            <w:pPr>
+              <w:spacing w:before="0" w:after="40" w:line="260" w:lineRule="auto"/>
+            </w:pPr>
+            <w:r>
+              <w:rPr>
+                <w:rFonts w:ascii="Arial" w:hAnsi="Arial" w:eastAsia="Arial" w:cs="Arial"/>
+                <w:b w:val="0"/>
+                <w:color w:val="000000"/>
+                <w:sz w:val="20"/>
+              </w:rPr>
+              <w:t>bcrypt custo ≥ 10; HTTPS com TLS ≥ 1.2; sessão de 60 min; LGPD; agenda pública sem dados pessoais.</w:t>
+            </w:r>
+          </w:p>
+        </w:tc>
+        <w:tc>
+          <w:tcPr>
+            <w:tcW w:type="dxa" w:w="3628"/>
+            <w:tcMar>
+              <w:top w:w="60" w:type="dxa"/>
+              <w:left w:w="100" w:type="dxa"/>
+              <w:bottom w:w="60" w:type="dxa"/>
+              <w:right w:w="100" w:type="dxa"/>
+            </w:tcMar>
+          </w:tcPr>
+          <w:p>
+            <w:pPr>
+              <w:spacing w:before="0" w:after="40" w:line="260" w:lineRule="auto"/>
+            </w:pPr>
+            <w:r>
+              <w:rPr>
+                <w:rFonts w:ascii="Arial" w:hAnsi="Arial" w:eastAsia="Arial" w:cs="Arial"/>
+                <w:b w:val="0"/>
+                <w:color w:val="000000"/>
+                <w:sz w:val="20"/>
+              </w:rPr>
+              <w:t>bcrypt custo 12, sessão de 60 min com renovação e acesso por perfil e vínculo. O HTTPS vem da Vercel e do Render. A agenda pública é do MOD07.</w:t>
+            </w:r>
+          </w:p>
+        </w:tc>
+        <w:tc>
+          <w:tcPr>
+            <w:tcW w:type="dxa" w:w="1928"/>
+            <w:tcMar>
+              <w:top w:w="60" w:type="dxa"/>
+              <w:left w:w="100" w:type="dxa"/>
+              <w:bottom w:w="60" w:type="dxa"/>
+              <w:right w:w="100" w:type="dxa"/>
+            </w:tcMar>
+          </w:tcPr>
+          <w:p>
+            <w:pPr>
+              <w:spacing w:before="0" w:after="40" w:line="260" w:lineRule="auto"/>
+            </w:pPr>
+            <w:r>
+              <w:rPr>
+                <w:rFonts w:ascii="Arial" w:hAnsi="Arial" w:eastAsia="Arial" w:cs="Arial"/>
+                <w:b w:val="0"/>
+                <w:color w:val="000000"/>
+                <w:sz w:val="20"/>
+              </w:rPr>
+              <w:t>Parcial: HTTPS depende da publicação; agenda planejada</w:t>
+            </w:r>
+          </w:p>
+        </w:tc>
+      </w:tr>
+      <w:tr>
+        <w:trPr>
+          <w:cantSplit w:val="1"/>
+        </w:trPr>
+        <w:tc>
+          <w:tcPr>
+            <w:tcW w:type="dxa" w:w="907"/>
+            <w:tcMar>
+              <w:top w:w="60" w:type="dxa"/>
+              <w:left w:w="100" w:type="dxa"/>
+              <w:bottom w:w="60" w:type="dxa"/>
+              <w:right w:w="100" w:type="dxa"/>
+            </w:tcMar>
+          </w:tcPr>
+          <w:p>
+            <w:pPr>
+              <w:spacing w:before="0" w:after="40" w:line="260" w:lineRule="auto"/>
+            </w:pPr>
+            <w:r>
+              <w:rPr>
+                <w:rFonts w:ascii="Arial" w:hAnsi="Arial" w:eastAsia="Arial" w:cs="Arial"/>
+                <w:b w:val="0"/>
+                <w:color w:val="000000"/>
+                <w:sz w:val="20"/>
+              </w:rPr>
+              <w:t>RNF03</w:t>
+            </w:r>
+          </w:p>
+        </w:tc>
+        <w:tc>
+          <w:tcPr>
+            <w:tcW w:type="dxa" w:w="2608"/>
+            <w:tcMar>
+              <w:top w:w="60" w:type="dxa"/>
+              <w:left w:w="100" w:type="dxa"/>
+              <w:bottom w:w="60" w:type="dxa"/>
+              <w:right w:w="100" w:type="dxa"/>
+            </w:tcMar>
+          </w:tcPr>
+          <w:p>
+            <w:pPr>
+              <w:spacing w:before="0" w:after="40" w:line="260" w:lineRule="auto"/>
+            </w:pPr>
+            <w:r>
+              <w:rPr>
+                <w:rFonts w:ascii="Arial" w:hAnsi="Arial" w:eastAsia="Arial" w:cs="Arial"/>
+                <w:b w:val="0"/>
+                <w:color w:val="000000"/>
+                <w:sz w:val="20"/>
+              </w:rPr>
+              <w:t>Log não editável com usuário, data/hora (America/Manaus), campo, valor anterior e novo; retenção de 5 anos.</w:t>
+            </w:r>
+          </w:p>
+        </w:tc>
+        <w:tc>
+          <w:tcPr>
+            <w:tcW w:type="dxa" w:w="3628"/>
+            <w:tcMar>
+              <w:top w:w="60" w:type="dxa"/>
+              <w:left w:w="100" w:type="dxa"/>
+              <w:bottom w:w="60" w:type="dxa"/>
+              <w:right w:w="100" w:type="dxa"/>
+            </w:tcMar>
+          </w:tcPr>
+          <w:p>
+            <w:pPr>
+              <w:spacing w:before="0" w:after="40" w:line="260" w:lineRule="auto"/>
+            </w:pPr>
+            <w:r>
+              <w:rPr>
+                <w:rFonts w:ascii="Arial" w:hAnsi="Arial" w:eastAsia="Arial" w:cs="Arial"/>
+                <w:b w:val="0"/>
+                <w:color w:val="000000"/>
+                <w:sz w:val="20"/>
+              </w:rPr>
+              <w:t>Log com todos esses campos; o banco recusa alterar ou apagar (migração 0003). A data é gravada em UTC e mostrada no fuso de Manaus.</w:t>
+            </w:r>
+          </w:p>
+        </w:tc>
+        <w:tc>
+          <w:tcPr>
+            <w:tcW w:type="dxa" w:w="1928"/>
+            <w:tcMar>
+              <w:top w:w="60" w:type="dxa"/>
+              <w:left w:w="100" w:type="dxa"/>
+              <w:bottom w:w="60" w:type="dxa"/>
+              <w:right w:w="100" w:type="dxa"/>
+            </w:tcMar>
+          </w:tcPr>
+          <w:p>
+            <w:pPr>
+              <w:spacing w:before="0" w:after="40" w:line="260" w:lineRule="auto"/>
+            </w:pPr>
+            <w:r>
+              <w:rPr>
+                <w:rFonts w:ascii="Arial" w:hAnsi="Arial" w:eastAsia="Arial" w:cs="Arial"/>
+                <w:b w:val="0"/>
+                <w:color w:val="000000"/>
+                <w:sz w:val="20"/>
+              </w:rPr>
+              <w:t>Parcial: a retenção de 5 anos depende do backup planejado</w:t>
+            </w:r>
+          </w:p>
+        </w:tc>
+      </w:tr>
+      <w:tr>
+        <w:trPr>
+          <w:cantSplit w:val="1"/>
+        </w:trPr>
+        <w:tc>
+          <w:tcPr>
+            <w:tcW w:type="dxa" w:w="907"/>
+            <w:tcMar>
+              <w:top w:w="60" w:type="dxa"/>
+              <w:left w:w="100" w:type="dxa"/>
+              <w:bottom w:w="60" w:type="dxa"/>
+              <w:right w:w="100" w:type="dxa"/>
+            </w:tcMar>
+          </w:tcPr>
+          <w:p>
+            <w:pPr>
+              <w:spacing w:before="0" w:after="40" w:line="260" w:lineRule="auto"/>
+            </w:pPr>
+            <w:r>
+              <w:rPr>
+                <w:rFonts w:ascii="Arial" w:hAnsi="Arial" w:eastAsia="Arial" w:cs="Arial"/>
+                <w:b w:val="0"/>
+                <w:color w:val="000000"/>
+                <w:sz w:val="20"/>
+              </w:rPr>
+              <w:t>RNF04</w:t>
+            </w:r>
+          </w:p>
+        </w:tc>
+        <w:tc>
+          <w:tcPr>
+            <w:tcW w:type="dxa" w:w="2608"/>
+            <w:tcMar>
+              <w:top w:w="60" w:type="dxa"/>
+              <w:left w:w="100" w:type="dxa"/>
+              <w:bottom w:w="60" w:type="dxa"/>
+              <w:right w:w="100" w:type="dxa"/>
+            </w:tcMar>
+          </w:tcPr>
+          <w:p>
+            <w:pPr>
+              <w:spacing w:before="0" w:after="40" w:line="260" w:lineRule="auto"/>
+            </w:pPr>
+            <w:r>
+              <w:rPr>
+                <w:rFonts w:ascii="Arial" w:hAnsi="Arial" w:eastAsia="Arial" w:cs="Arial"/>
+                <w:b w:val="0"/>
+                <w:color w:val="000000"/>
+                <w:sz w:val="20"/>
+              </w:rPr>
+              <w:t>Sem rolagem horizontal em 360 e 768 px, no Chrome e no Safari móveis.</w:t>
+            </w:r>
+          </w:p>
+        </w:tc>
+        <w:tc>
+          <w:tcPr>
+            <w:tcW w:type="dxa" w:w="3628"/>
+            <w:tcMar>
+              <w:top w:w="60" w:type="dxa"/>
+              <w:left w:w="100" w:type="dxa"/>
+              <w:bottom w:w="60" w:type="dxa"/>
+              <w:right w:w="100" w:type="dxa"/>
+            </w:tcMar>
+          </w:tcPr>
+          <w:p>
+            <w:pPr>
+              <w:spacing w:before="0" w:after="40" w:line="260" w:lineRule="auto"/>
+            </w:pPr>
+            <w:r>
+              <w:rPr>
+                <w:rFonts w:ascii="Arial" w:hAnsi="Arial" w:eastAsia="Arial" w:cs="Arial"/>
+                <w:b w:val="0"/>
+                <w:color w:val="000000"/>
+                <w:sz w:val="20"/>
+              </w:rPr>
+              <w:t>Telas testadas em 360 e 768 px no Google Chrome, sem rolagem horizontal (59 checagens).</w:t>
+            </w:r>
+          </w:p>
+        </w:tc>
+        <w:tc>
+          <w:tcPr>
+            <w:tcW w:type="dxa" w:w="1928"/>
+            <w:tcMar>
+              <w:top w:w="60" w:type="dxa"/>
+              <w:left w:w="100" w:type="dxa"/>
+              <w:bottom w:w="60" w:type="dxa"/>
+              <w:right w:w="100" w:type="dxa"/>
+            </w:tcMar>
+          </w:tcPr>
+          <w:p>
+            <w:pPr>
+              <w:spacing w:before="0" w:after="40" w:line="260" w:lineRule="auto"/>
+            </w:pPr>
+            <w:r>
+              <w:rPr>
+                <w:rFonts w:ascii="Arial" w:hAnsi="Arial" w:eastAsia="Arial" w:cs="Arial"/>
+                <w:b w:val="0"/>
+                <w:color w:val="000000"/>
+                <w:sz w:val="20"/>
+              </w:rPr>
+              <w:t>Parcial: falta o teste no Safari</w:t>
+            </w:r>
+          </w:p>
+        </w:tc>
+      </w:tr>
+      <w:tr>
+        <w:trPr>
+          <w:cantSplit w:val="1"/>
+        </w:trPr>
+        <w:tc>
+          <w:tcPr>
+            <w:tcW w:type="dxa" w:w="907"/>
+            <w:tcMar>
+              <w:top w:w="60" w:type="dxa"/>
+              <w:left w:w="100" w:type="dxa"/>
+              <w:bottom w:w="60" w:type="dxa"/>
+              <w:right w:w="100" w:type="dxa"/>
+            </w:tcMar>
+          </w:tcPr>
+          <w:p>
+            <w:pPr>
+              <w:spacing w:before="0" w:after="40" w:line="260" w:lineRule="auto"/>
+            </w:pPr>
+            <w:r>
+              <w:rPr>
+                <w:rFonts w:ascii="Arial" w:hAnsi="Arial" w:eastAsia="Arial" w:cs="Arial"/>
+                <w:b w:val="0"/>
+                <w:color w:val="000000"/>
+                <w:sz w:val="20"/>
+              </w:rPr>
+              <w:t>RNF05</w:t>
+            </w:r>
+          </w:p>
+        </w:tc>
+        <w:tc>
+          <w:tcPr>
+            <w:tcW w:type="dxa" w:w="2608"/>
+            <w:tcMar>
+              <w:top w:w="60" w:type="dxa"/>
+              <w:left w:w="100" w:type="dxa"/>
+              <w:bottom w:w="60" w:type="dxa"/>
+              <w:right w:w="100" w:type="dxa"/>
+            </w:tcMar>
+          </w:tcPr>
+          <w:p>
+            <w:pPr>
+              <w:spacing w:before="0" w:after="40" w:line="260" w:lineRule="auto"/>
+            </w:pPr>
+            <w:r>
+              <w:rPr>
+                <w:rFonts w:ascii="Arial" w:hAnsi="Arial" w:eastAsia="Arial" w:cs="Arial"/>
+                <w:b w:val="0"/>
+                <w:color w:val="000000"/>
+                <w:sz w:val="20"/>
+              </w:rPr>
+              <w:t>Ata em PDF em até 5 s (p95) após a confirmação do resultado.</w:t>
+            </w:r>
+          </w:p>
+        </w:tc>
+        <w:tc>
+          <w:tcPr>
+            <w:tcW w:type="dxa" w:w="3628"/>
+            <w:tcMar>
+              <w:top w:w="60" w:type="dxa"/>
+              <w:left w:w="100" w:type="dxa"/>
+              <w:bottom w:w="60" w:type="dxa"/>
+              <w:right w:w="100" w:type="dxa"/>
+            </w:tcMar>
+          </w:tcPr>
+          <w:p>
+            <w:pPr>
+              <w:spacing w:before="0" w:after="40" w:line="260" w:lineRule="auto"/>
+            </w:pPr>
+            <w:r>
+              <w:rPr>
+                <w:rFonts w:ascii="Arial" w:hAnsi="Arial" w:eastAsia="Arial" w:cs="Arial"/>
+                <w:b w:val="0"/>
+                <w:color w:val="000000"/>
+                <w:sz w:val="20"/>
+              </w:rPr>
+              <w:t>Gerador de PDF previsto na API (MOD04).</w:t>
+            </w:r>
+          </w:p>
+        </w:tc>
+        <w:tc>
+          <w:tcPr>
+            <w:tcW w:type="dxa" w:w="1928"/>
+            <w:tcMar>
+              <w:top w:w="60" w:type="dxa"/>
+              <w:left w:w="100" w:type="dxa"/>
+              <w:bottom w:w="60" w:type="dxa"/>
+              <w:right w:w="100" w:type="dxa"/>
+            </w:tcMar>
+          </w:tcPr>
+          <w:p>
+            <w:pPr>
+              <w:spacing w:before="0" w:after="40" w:line="260" w:lineRule="auto"/>
+            </w:pPr>
+            <w:r>
+              <w:rPr>
+                <w:rFonts w:ascii="Arial" w:hAnsi="Arial" w:eastAsia="Arial" w:cs="Arial"/>
+                <w:b w:val="0"/>
+                <w:color w:val="000000"/>
+                <w:sz w:val="20"/>
+              </w:rPr>
+              <w:t>Planejado</w:t>
+            </w:r>
+          </w:p>
+        </w:tc>
+      </w:tr>
+      <w:tr>
+        <w:trPr>
+          <w:cantSplit w:val="1"/>
+        </w:trPr>
+        <w:tc>
+          <w:tcPr>
+            <w:tcW w:type="dxa" w:w="907"/>
+            <w:tcMar>
+              <w:top w:w="60" w:type="dxa"/>
+              <w:left w:w="100" w:type="dxa"/>
+              <w:bottom w:w="60" w:type="dxa"/>
+              <w:right w:w="100" w:type="dxa"/>
+            </w:tcMar>
+          </w:tcPr>
+          <w:p>
+            <w:pPr>
+              <w:spacing w:before="0" w:after="40" w:line="260" w:lineRule="auto"/>
+            </w:pPr>
+            <w:r>
+              <w:rPr>
+                <w:rFonts w:ascii="Arial" w:hAnsi="Arial" w:eastAsia="Arial" w:cs="Arial"/>
+                <w:b w:val="0"/>
+                <w:color w:val="000000"/>
+                <w:sz w:val="20"/>
+              </w:rPr>
+              <w:t>RNF06</w:t>
+            </w:r>
+          </w:p>
+        </w:tc>
+        <w:tc>
+          <w:tcPr>
+            <w:tcW w:type="dxa" w:w="2608"/>
+            <w:tcMar>
+              <w:top w:w="60" w:type="dxa"/>
+              <w:left w:w="100" w:type="dxa"/>
+              <w:bottom w:w="60" w:type="dxa"/>
+              <w:right w:w="100" w:type="dxa"/>
+            </w:tcMar>
+          </w:tcPr>
+          <w:p>
+            <w:pPr>
+              <w:spacing w:before="0" w:after="40" w:line="260" w:lineRule="auto"/>
+            </w:pPr>
+            <w:r>
+              <w:rPr>
+                <w:rFonts w:ascii="Arial" w:hAnsi="Arial" w:eastAsia="Arial" w:cs="Arial"/>
+                <w:b w:val="0"/>
+                <w:color w:val="000000"/>
+                <w:sz w:val="20"/>
+              </w:rPr>
+              <w:t>Sem protocolo duplicado; falha de envio não apaga a versão anterior; SHA-256 conferido no envio e na leitura.</w:t>
+            </w:r>
+          </w:p>
+        </w:tc>
+        <w:tc>
+          <w:tcPr>
+            <w:tcW w:type="dxa" w:w="3628"/>
+            <w:tcMar>
+              <w:top w:w="60" w:type="dxa"/>
+              <w:left w:w="100" w:type="dxa"/>
+              <w:bottom w:w="60" w:type="dxa"/>
+              <w:right w:w="100" w:type="dxa"/>
+            </w:tcMar>
+          </w:tcPr>
+          <w:p>
+            <w:pPr>
+              <w:spacing w:before="0" w:after="40" w:line="260" w:lineRule="auto"/>
+            </w:pPr>
+            <w:r>
+              <w:rPr>
+                <w:rFonts w:ascii="Arial" w:hAnsi="Arial" w:eastAsia="Arial" w:cs="Arial"/>
+                <w:b w:val="0"/>
+                <w:color w:val="000000"/>
+                <w:sz w:val="20"/>
+              </w:rPr>
+              <w:t>Protocolo com trava de linha e restrição única; arquivo validado antes de substituir o anterior; SHA-256 gravado no envio e conferido ao ler (fotos). Os PDFs do TCC seguem o mesmo padrão.</w:t>
+            </w:r>
+          </w:p>
+        </w:tc>
+        <w:tc>
+          <w:tcPr>
+            <w:tcW w:type="dxa" w:w="1928"/>
+            <w:tcMar>
+              <w:top w:w="60" w:type="dxa"/>
+              <w:left w:w="100" w:type="dxa"/>
+              <w:bottom w:w="60" w:type="dxa"/>
+              <w:right w:w="100" w:type="dxa"/>
+            </w:tcMar>
+          </w:tcPr>
+          <w:p>
+            <w:pPr>
+              <w:spacing w:before="0" w:after="40" w:line="260" w:lineRule="auto"/>
+            </w:pPr>
+            <w:r>
+              <w:rPr>
+                <w:rFonts w:ascii="Arial" w:hAnsi="Arial" w:eastAsia="Arial" w:cs="Arial"/>
+                <w:b w:val="0"/>
+                <w:color w:val="000000"/>
+                <w:sz w:val="20"/>
+              </w:rPr>
+              <w:t>Atendido para fotos e protocolo; PDFs com o RAN07</w:t>
+            </w:r>
+          </w:p>
+        </w:tc>
+      </w:tr>
+      <w:tr>
+        <w:trPr>
+          <w:cantSplit w:val="1"/>
+        </w:trPr>
+        <w:tc>
+          <w:tcPr>
+            <w:tcW w:type="dxa" w:w="907"/>
+            <w:tcMar>
+              <w:top w:w="60" w:type="dxa"/>
+              <w:left w:w="100" w:type="dxa"/>
+              <w:bottom w:w="60" w:type="dxa"/>
+              <w:right w:w="100" w:type="dxa"/>
+            </w:tcMar>
+          </w:tcPr>
+          <w:p>
+            <w:pPr>
+              <w:spacing w:before="0" w:after="40" w:line="260" w:lineRule="auto"/>
+            </w:pPr>
+            <w:r>
+              <w:rPr>
+                <w:rFonts w:ascii="Arial" w:hAnsi="Arial" w:eastAsia="Arial" w:cs="Arial"/>
+                <w:b w:val="0"/>
+                <w:color w:val="000000"/>
+                <w:sz w:val="20"/>
+              </w:rPr>
+              <w:t>RNF07</w:t>
+            </w:r>
+          </w:p>
+        </w:tc>
+        <w:tc>
+          <w:tcPr>
+            <w:tcW w:type="dxa" w:w="2608"/>
+            <w:tcMar>
+              <w:top w:w="60" w:type="dxa"/>
+              <w:left w:w="100" w:type="dxa"/>
+              <w:bottom w:w="60" w:type="dxa"/>
+              <w:right w:w="100" w:type="dxa"/>
+            </w:tcMar>
+          </w:tcPr>
+          <w:p>
+            <w:pPr>
+              <w:spacing w:before="0" w:after="40" w:line="260" w:lineRule="auto"/>
+            </w:pPr>
+            <w:r>
+              <w:rPr>
+                <w:rFonts w:ascii="Arial" w:hAnsi="Arial" w:eastAsia="Arial" w:cs="Arial"/>
+                <w:b w:val="0"/>
+                <w:color w:val="000000"/>
+                <w:sz w:val="20"/>
+              </w:rPr>
+              <w:t>99% de disponibilidade no pico e recuperação em até 30 min.</w:t>
+            </w:r>
+          </w:p>
+        </w:tc>
+        <w:tc>
+          <w:tcPr>
+            <w:tcW w:type="dxa" w:w="3628"/>
+            <w:tcMar>
+              <w:top w:w="60" w:type="dxa"/>
+              <w:left w:w="100" w:type="dxa"/>
+              <w:bottom w:w="60" w:type="dxa"/>
+              <w:right w:w="100" w:type="dxa"/>
+            </w:tcMar>
+          </w:tcPr>
+          <w:p>
+            <w:pPr>
+              <w:spacing w:before="0" w:after="40" w:line="260" w:lineRule="auto"/>
+            </w:pPr>
+            <w:r>
+              <w:rPr>
+                <w:rFonts w:ascii="Arial" w:hAnsi="Arial" w:eastAsia="Arial" w:cs="Arial"/>
+                <w:b w:val="0"/>
+                <w:color w:val="000000"/>
+                <w:sz w:val="20"/>
+              </w:rPr>
+              <w:t>No plano grátis do Render a API dorme sem uso; o diagrama de implantação prevê monitoramento e backup.</w:t>
+            </w:r>
+          </w:p>
+        </w:tc>
+        <w:tc>
+          <w:tcPr>
+            <w:tcW w:type="dxa" w:w="1928"/>
+            <w:tcMar>
+              <w:top w:w="60" w:type="dxa"/>
+              <w:left w:w="100" w:type="dxa"/>
+              <w:bottom w:w="60" w:type="dxa"/>
+              <w:right w:w="100" w:type="dxa"/>
+            </w:tcMar>
+          </w:tcPr>
+          <w:p>
+            <w:pPr>
+              <w:spacing w:before="0" w:after="40" w:line="260" w:lineRule="auto"/>
+            </w:pPr>
+            <w:r>
+              <w:rPr>
+                <w:rFonts w:ascii="Arial" w:hAnsi="Arial" w:eastAsia="Arial" w:cs="Arial"/>
+                <w:b w:val="0"/>
+                <w:color w:val="000000"/>
+                <w:sz w:val="20"/>
+              </w:rPr>
+              <w:t>Planejado: exige plano pago ou monitoramento</w:t>
             </w:r>
           </w:p>
         </w:tc>
@@ -5393,6 +5981,108 @@
       <w:pPr>
         <w:spacing w:before="0" w:after="60"/>
       </w:pPr>
+    </w:p>
+    <w:p>
+      <w:pPr>
+        <w:spacing w:before="0" w:after="120" w:line="276" w:lineRule="auto"/>
+        <w:jc w:val="both"/>
+      </w:pPr>
+      <w:r>
+        <w:rPr>
+          <w:rFonts w:ascii="Arial" w:hAnsi="Arial" w:eastAsia="Arial" w:cs="Arial"/>
+          <w:b w:val="0"/>
+          <w:color w:val="000000"/>
+          <w:sz w:val="22"/>
+        </w:rPr>
+        <w:t>Pontos em que o sistema difere da planilha, por decisão registrada da equipe:</w:t>
+      </w:r>
+    </w:p>
+    <w:p>
+      <w:pPr>
+        <w:tabs>
+          <w:tab w:pos="510" w:val="left"/>
+        </w:tabs>
+        <w:spacing w:before="0" w:after="80" w:line="276" w:lineRule="auto"/>
+        <w:ind w:left="510" w:hanging="340"/>
+        <w:jc w:val="both"/>
+      </w:pPr>
+      <w:r>
+        <w:rPr>
+          <w:rFonts w:ascii="Arial" w:hAnsi="Arial" w:eastAsia="Arial" w:cs="Arial"/>
+          <w:b w:val="0"/>
+          <w:color w:val="000000"/>
+          <w:sz w:val="22"/>
+        </w:rPr>
+        <w:t>•</w:t>
+        <w:tab/>
+      </w:r>
+      <w:r>
+        <w:rPr>
+          <w:rFonts w:ascii="Arial" w:hAnsi="Arial" w:eastAsia="Arial" w:cs="Arial"/>
+          <w:b w:val="0"/>
+          <w:color w:val="000000"/>
+          <w:sz w:val="22"/>
+        </w:rPr>
+        <w:t>RN16 diz que as recusas de orientação não são guardadas. O sistema guarda a recusa e o motivo, porque o RNF03 exige registrar toda alteração; a recusa não vale como vínculo. Sugere-se ajustar o texto da RN16.</w:t>
+      </w:r>
+    </w:p>
+    <w:p>
+      <w:pPr>
+        <w:tabs>
+          <w:tab w:pos="510" w:val="left"/>
+        </w:tabs>
+        <w:spacing w:before="0" w:after="80" w:line="276" w:lineRule="auto"/>
+        <w:ind w:left="510" w:hanging="340"/>
+        <w:jc w:val="both"/>
+      </w:pPr>
+      <w:r>
+        <w:rPr>
+          <w:rFonts w:ascii="Arial" w:hAnsi="Arial" w:eastAsia="Arial" w:cs="Arial"/>
+          <w:b w:val="0"/>
+          <w:color w:val="000000"/>
+          <w:sz w:val="22"/>
+        </w:rPr>
+        <w:t>•</w:t>
+        <w:tab/>
+      </w:r>
+      <w:r>
+        <w:rPr>
+          <w:rFonts w:ascii="Arial" w:hAnsi="Arial" w:eastAsia="Arial" w:cs="Arial"/>
+          <w:b w:val="0"/>
+          <w:color w:val="000000"/>
+          <w:sz w:val="22"/>
+        </w:rPr>
+        <w:t>A planilha fala em e-mail institucional; por decisão da equipe, o cadastro aceita qualquer e-mail válido.</w:t>
+      </w:r>
+    </w:p>
+    <w:p>
+      <w:pPr>
+        <w:tabs>
+          <w:tab w:pos="510" w:val="left"/>
+        </w:tabs>
+        <w:spacing w:before="0" w:after="80" w:line="276" w:lineRule="auto"/>
+        <w:ind w:left="510" w:hanging="340"/>
+        <w:jc w:val="both"/>
+      </w:pPr>
+      <w:r>
+        <w:rPr>
+          <w:rFonts w:ascii="Arial" w:hAnsi="Arial" w:eastAsia="Arial" w:cs="Arial"/>
+          <w:b w:val="0"/>
+          <w:color w:val="000000"/>
+          <w:sz w:val="22"/>
+        </w:rPr>
+        <w:t>•</w:t>
+        <w:tab/>
+      </w:r>
+      <w:r>
+        <w:rPr>
+          <w:rFonts w:ascii="Arial" w:hAnsi="Arial" w:eastAsia="Arial" w:cs="Arial"/>
+          <w:b w:val="0"/>
+          <w:color w:val="000000"/>
+          <w:sz w:val="22"/>
+        </w:rPr>
+        <w:t>O DS-FL01 envia o e-mail ao orientador só na submissão; como o RBN03.03 exige o aceite antes, o aviso sai quando o aluno indica o orientador, e outro sai na submissão.</w:t>
+      </w:r>
     </w:p>
     <w:p>
       <w:pPr>
@@ -5407,7 +6097,396 @@
           <w:color w:val="000000"/>
           <w:sz w:val="30"/>
         </w:rPr>
-        <w:t>12. APROVAÇÕES</w:t>
+        <w:t>11. VERIFICAÇÃO DA ARQUITETURA</w:t>
+      </w:r>
+    </w:p>
+    <w:p>
+      <w:pPr>
+        <w:tabs>
+          <w:tab w:pos="510" w:val="left"/>
+        </w:tabs>
+        <w:spacing w:before="0" w:after="80" w:line="276" w:lineRule="auto"/>
+        <w:ind w:left="510" w:hanging="340"/>
+        <w:jc w:val="both"/>
+      </w:pPr>
+      <w:r>
+        <w:rPr>
+          <w:rFonts w:ascii="Arial" w:hAnsi="Arial" w:eastAsia="Arial" w:cs="Arial"/>
+          <w:b w:val="0"/>
+          <w:color w:val="000000"/>
+          <w:sz w:val="22"/>
+        </w:rPr>
+        <w:t>•</w:t>
+        <w:tab/>
+      </w:r>
+      <w:r>
+        <w:rPr>
+          <w:rFonts w:ascii="Arial" w:hAnsi="Arial" w:eastAsia="Arial" w:cs="Arial"/>
+          <w:b w:val="0"/>
+          <w:color w:val="000000"/>
+          <w:sz w:val="22"/>
+        </w:rPr>
+        <w:t>Suíte da API (backend/tests, pytest): 123 execuções em SQLite e em PostgreSQL 16, cobrindo as 51 operações do contrato.</w:t>
+      </w:r>
+    </w:p>
+    <w:p>
+      <w:pPr>
+        <w:tabs>
+          <w:tab w:pos="510" w:val="left"/>
+        </w:tabs>
+        <w:spacing w:before="0" w:after="80" w:line="276" w:lineRule="auto"/>
+        <w:ind w:left="510" w:hanging="340"/>
+        <w:jc w:val="both"/>
+      </w:pPr>
+      <w:r>
+        <w:rPr>
+          <w:rFonts w:ascii="Arial" w:hAnsi="Arial" w:eastAsia="Arial" w:cs="Arial"/>
+          <w:b w:val="0"/>
+          <w:color w:val="000000"/>
+          <w:sz w:val="22"/>
+        </w:rPr>
+        <w:t>•</w:t>
+        <w:tab/>
+      </w:r>
+      <w:r>
+        <w:rPr>
+          <w:rFonts w:ascii="Arial" w:hAnsi="Arial" w:eastAsia="Arial" w:cs="Arial"/>
+          <w:b w:val="0"/>
+          <w:color w:val="000000"/>
+          <w:sz w:val="22"/>
+        </w:rPr>
+        <w:t>Testes no navegador (docs/testes/e2e): fluxos completos pela tela e responsividade em 360 e 768 px.</w:t>
+      </w:r>
+    </w:p>
+    <w:p>
+      <w:pPr>
+        <w:tabs>
+          <w:tab w:pos="510" w:val="left"/>
+        </w:tabs>
+        <w:spacing w:before="0" w:after="80" w:line="276" w:lineRule="auto"/>
+        <w:ind w:left="510" w:hanging="340"/>
+        <w:jc w:val="both"/>
+      </w:pPr>
+      <w:r>
+        <w:rPr>
+          <w:rFonts w:ascii="Arial" w:hAnsi="Arial" w:eastAsia="Arial" w:cs="Arial"/>
+          <w:b w:val="0"/>
+          <w:color w:val="000000"/>
+          <w:sz w:val="22"/>
+        </w:rPr>
+        <w:t>•</w:t>
+        <w:tab/>
+      </w:r>
+      <w:r>
+        <w:rPr>
+          <w:rFonts w:ascii="Arial" w:hAnsi="Arial" w:eastAsia="Arial" w:cs="Arial"/>
+          <w:b w:val="0"/>
+          <w:color w:val="000000"/>
+          <w:sz w:val="22"/>
+        </w:rPr>
+        <w:t>Teste de carga (backend/scripts/carga_rnf01.py): RNF01 e RNF06.</w:t>
+      </w:r>
+    </w:p>
+    <w:p>
+      <w:pPr>
+        <w:tabs>
+          <w:tab w:pos="510" w:val="left"/>
+        </w:tabs>
+        <w:spacing w:before="0" w:after="80" w:line="276" w:lineRule="auto"/>
+        <w:ind w:left="510" w:hanging="340"/>
+        <w:jc w:val="both"/>
+      </w:pPr>
+      <w:r>
+        <w:rPr>
+          <w:rFonts w:ascii="Arial" w:hAnsi="Arial" w:eastAsia="Arial" w:cs="Arial"/>
+          <w:b w:val="0"/>
+          <w:color w:val="000000"/>
+          <w:sz w:val="22"/>
+        </w:rPr>
+        <w:t>•</w:t>
+        <w:tab/>
+      </w:r>
+      <w:r>
+        <w:rPr>
+          <w:rFonts w:ascii="Arial" w:hAnsi="Arial" w:eastAsia="Arial" w:cs="Arial"/>
+          <w:b w:val="0"/>
+          <w:color w:val="000000"/>
+          <w:sz w:val="22"/>
+        </w:rPr>
+        <w:t>Resultados e evidências: Relatório de Execução de Testes (pasta 07_Testes).</w:t>
+      </w:r>
+    </w:p>
+    <w:p>
+      <w:pPr>
+        <w:pStyle w:val="Heading1"/>
+        <w:keepNext/>
+        <w:spacing w:before="360" w:after="200"/>
+      </w:pPr>
+      <w:r>
+        <w:rPr>
+          <w:rFonts w:ascii="Arial" w:hAnsi="Arial" w:eastAsia="Arial" w:cs="Arial"/>
+          <w:b/>
+          <w:color w:val="000000"/>
+          <w:sz w:val="30"/>
+        </w:rPr>
+        <w:t>12. REGISTRO DE ALTERAÇÕES</w:t>
+      </w:r>
+    </w:p>
+    <w:tbl>
+      <w:tblPr>
+        <w:tblW w:type="auto" w:w="0"/>
+        <w:tblLook w:firstColumn="1" w:firstRow="1" w:lastColumn="0" w:lastRow="0" w:noHBand="0" w:noVBand="1" w:val="04A0"/>
+        <w:tblBorders>
+          <w:top w:val="single" w:sz="6" w:space="0" w:color="000000"/>
+          <w:left w:val="single" w:sz="6" w:space="0" w:color="000000"/>
+          <w:bottom w:val="single" w:sz="6" w:space="0" w:color="000000"/>
+          <w:right w:val="single" w:sz="6" w:space="0" w:color="000000"/>
+          <w:insideH w:val="single" w:sz="6" w:space="0" w:color="000000"/>
+          <w:insideV w:val="single" w:sz="6" w:space="0" w:color="000000"/>
+        </w:tblBorders>
+        <w:tblLayout w:type="fixed"/>
+      </w:tblPr>
+      <w:tblGrid>
+        <w:gridCol w:w="2268"/>
+        <w:gridCol w:w="2268"/>
+        <w:gridCol w:w="2268"/>
+        <w:gridCol w:w="2268"/>
+      </w:tblGrid>
+      <w:tr>
+        <w:trPr>
+          <w:tblHeader w:val="1"/>
+          <w:cantSplit w:val="1"/>
+        </w:trPr>
+        <w:tc>
+          <w:tcPr>
+            <w:tcW w:type="dxa" w:w="1020"/>
+            <w:shd w:val="clear" w:fill="000000"/>
+            <w:tcMar>
+              <w:top w:w="60" w:type="dxa"/>
+              <w:left w:w="100" w:type="dxa"/>
+              <w:bottom w:w="60" w:type="dxa"/>
+              <w:right w:w="100" w:type="dxa"/>
+            </w:tcMar>
+          </w:tcPr>
+          <w:p>
+            <w:pPr>
+              <w:spacing w:before="0" w:after="40" w:line="260" w:lineRule="auto"/>
+            </w:pPr>
+            <w:r>
+              <w:rPr>
+                <w:rFonts w:ascii="Arial" w:hAnsi="Arial" w:eastAsia="Arial" w:cs="Arial"/>
+                <w:b/>
+                <w:color w:val="FFFFFF"/>
+                <w:sz w:val="20"/>
+              </w:rPr>
+              <w:t>Versão</w:t>
+            </w:r>
+          </w:p>
+        </w:tc>
+        <w:tc>
+          <w:tcPr>
+            <w:tcW w:type="dxa" w:w="1361"/>
+            <w:shd w:val="clear" w:fill="000000"/>
+            <w:tcMar>
+              <w:top w:w="60" w:type="dxa"/>
+              <w:left w:w="100" w:type="dxa"/>
+              <w:bottom w:w="60" w:type="dxa"/>
+              <w:right w:w="100" w:type="dxa"/>
+            </w:tcMar>
+          </w:tcPr>
+          <w:p>
+            <w:pPr>
+              <w:spacing w:before="0" w:after="40" w:line="260" w:lineRule="auto"/>
+            </w:pPr>
+            <w:r>
+              <w:rPr>
+                <w:rFonts w:ascii="Arial" w:hAnsi="Arial" w:eastAsia="Arial" w:cs="Arial"/>
+                <w:b/>
+                <w:color w:val="FFFFFF"/>
+                <w:sz w:val="20"/>
+              </w:rPr>
+              <w:t>Data</w:t>
+            </w:r>
+          </w:p>
+        </w:tc>
+        <w:tc>
+          <w:tcPr>
+            <w:tcW w:type="dxa" w:w="4989"/>
+            <w:shd w:val="clear" w:fill="000000"/>
+            <w:tcMar>
+              <w:top w:w="60" w:type="dxa"/>
+              <w:left w:w="100" w:type="dxa"/>
+              <w:bottom w:w="60" w:type="dxa"/>
+              <w:right w:w="100" w:type="dxa"/>
+            </w:tcMar>
+          </w:tcPr>
+          <w:p>
+            <w:pPr>
+              <w:spacing w:before="0" w:after="40" w:line="260" w:lineRule="auto"/>
+            </w:pPr>
+            <w:r>
+              <w:rPr>
+                <w:rFonts w:ascii="Arial" w:hAnsi="Arial" w:eastAsia="Arial" w:cs="Arial"/>
+                <w:b/>
+                <w:color w:val="FFFFFF"/>
+                <w:sz w:val="20"/>
+              </w:rPr>
+              <w:t>Descrição</w:t>
+            </w:r>
+          </w:p>
+        </w:tc>
+        <w:tc>
+          <w:tcPr>
+            <w:tcW w:type="dxa" w:w="1701"/>
+            <w:shd w:val="clear" w:fill="000000"/>
+            <w:tcMar>
+              <w:top w:w="60" w:type="dxa"/>
+              <w:left w:w="100" w:type="dxa"/>
+              <w:bottom w:w="60" w:type="dxa"/>
+              <w:right w:w="100" w:type="dxa"/>
+            </w:tcMar>
+          </w:tcPr>
+          <w:p>
+            <w:pPr>
+              <w:spacing w:before="0" w:after="40" w:line="260" w:lineRule="auto"/>
+            </w:pPr>
+            <w:r>
+              <w:rPr>
+                <w:rFonts w:ascii="Arial" w:hAnsi="Arial" w:eastAsia="Arial" w:cs="Arial"/>
+                <w:b/>
+                <w:color w:val="FFFFFF"/>
+                <w:sz w:val="20"/>
+              </w:rPr>
+              <w:t>Responsável</w:t>
+            </w:r>
+          </w:p>
+        </w:tc>
+      </w:tr>
+      <w:tr>
+        <w:trPr>
+          <w:cantSplit w:val="1"/>
+        </w:trPr>
+        <w:tc>
+          <w:tcPr>
+            <w:tcW w:type="dxa" w:w="1020"/>
+            <w:tcMar>
+              <w:top w:w="60" w:type="dxa"/>
+              <w:left w:w="100" w:type="dxa"/>
+              <w:bottom w:w="60" w:type="dxa"/>
+              <w:right w:w="100" w:type="dxa"/>
+            </w:tcMar>
+          </w:tcPr>
+          <w:p>
+            <w:pPr>
+              <w:spacing w:before="0" w:after="40" w:line="260" w:lineRule="auto"/>
+            </w:pPr>
+            <w:r>
+              <w:rPr>
+                <w:rFonts w:ascii="Arial" w:hAnsi="Arial" w:eastAsia="Arial" w:cs="Arial"/>
+                <w:b w:val="0"/>
+                <w:color w:val="000000"/>
+                <w:sz w:val="20"/>
+              </w:rPr>
+              <w:t>1.0</w:t>
+            </w:r>
+          </w:p>
+        </w:tc>
+        <w:tc>
+          <w:tcPr>
+            <w:tcW w:type="dxa" w:w="1361"/>
+            <w:tcMar>
+              <w:top w:w="60" w:type="dxa"/>
+              <w:left w:w="100" w:type="dxa"/>
+              <w:bottom w:w="60" w:type="dxa"/>
+              <w:right w:w="100" w:type="dxa"/>
+            </w:tcMar>
+          </w:tcPr>
+          <w:p>
+            <w:pPr>
+              <w:spacing w:before="0" w:after="40" w:line="260" w:lineRule="auto"/>
+            </w:pPr>
+            <w:r>
+              <w:rPr>
+                <w:rFonts w:ascii="Arial" w:hAnsi="Arial" w:eastAsia="Arial" w:cs="Arial"/>
+                <w:b w:val="0"/>
+                <w:color w:val="000000"/>
+                <w:sz w:val="20"/>
+              </w:rPr>
+              <w:t>20/10/2026</w:t>
+            </w:r>
+          </w:p>
+        </w:tc>
+        <w:tc>
+          <w:tcPr>
+            <w:tcW w:type="dxa" w:w="4989"/>
+            <w:tcMar>
+              <w:top w:w="60" w:type="dxa"/>
+              <w:left w:w="100" w:type="dxa"/>
+              <w:bottom w:w="60" w:type="dxa"/>
+              <w:right w:w="100" w:type="dxa"/>
+            </w:tcMar>
+          </w:tcPr>
+          <w:p>
+            <w:pPr>
+              <w:spacing w:before="0" w:after="40" w:line="260" w:lineRule="auto"/>
+            </w:pPr>
+            <w:r>
+              <w:rPr>
+                <w:rFonts w:ascii="Arial" w:hAnsi="Arial" w:eastAsia="Arial" w:cs="Arial"/>
+                <w:b w:val="0"/>
+                <w:color w:val="000000"/>
+                <w:sz w:val="20"/>
+              </w:rPr>
+              <w:t>Criação do documento.</w:t>
+            </w:r>
+          </w:p>
+        </w:tc>
+        <w:tc>
+          <w:tcPr>
+            <w:tcW w:type="dxa" w:w="1701"/>
+            <w:tcMar>
+              <w:top w:w="60" w:type="dxa"/>
+              <w:left w:w="100" w:type="dxa"/>
+              <w:bottom w:w="60" w:type="dxa"/>
+              <w:right w:w="100" w:type="dxa"/>
+            </w:tcMar>
+          </w:tcPr>
+          <w:p>
+            <w:pPr>
+              <w:spacing w:before="0" w:after="40" w:line="260" w:lineRule="auto"/>
+            </w:pPr>
+            <w:r>
+              <w:rPr>
+                <w:rFonts w:ascii="Arial" w:hAnsi="Arial" w:eastAsia="Arial" w:cs="Arial"/>
+                <w:b w:val="0"/>
+                <w:color w:val="000000"/>
+                <w:sz w:val="20"/>
+              </w:rPr>
+              <w:t>Igor Leite</w:t>
+            </w:r>
+          </w:p>
+        </w:tc>
+      </w:tr>
+    </w:tbl>
+    <w:p>
+      <w:pPr>
+        <w:spacing w:before="0" w:after="60"/>
+      </w:pPr>
+    </w:p>
+    <w:p>
+      <w:pPr>
+        <w:pStyle w:val="Heading1"/>
+        <w:keepNext/>
+        <w:spacing w:before="360" w:after="200"/>
+      </w:pPr>
+      <w:r>
+        <w:rPr>
+          <w:rFonts w:ascii="Arial" w:hAnsi="Arial" w:eastAsia="Arial" w:cs="Arial"/>
+          <w:b/>
+          <w:color w:val="000000"/>
+          <w:sz w:val="30"/>
+        </w:rPr>
+        <w:t>13. APROVAÇÕES</w:t>
       </w:r>
     </w:p>
     <w:p>
@@ -5610,7 +6689,7 @@
           <w:color w:val="000000"/>
           <w:sz w:val="30"/>
         </w:rPr>
-        <w:t>13. REFERÊNCIAS</w:t>
+        <w:t>14. REFERÊNCIAS</w:t>
       </w:r>
     </w:p>
     <w:p>

</xml_diff>

<commit_message>
docs: implantação e arquitetura com o e-mail pela Brevo no ambiente integrado
</commit_message>
<xml_diff>
--- a/docs/arquitetura/Arquitetura_do_Sistema_SIGA_UEA.docx
+++ b/docs/arquitetura/Arquitetura_do_Sistema_SIGA_UEA.docx
@@ -734,7 +734,7 @@
         </w:rPr>
         <w:t>10. ATENDIMENTO AOS REQUISITOS NÃO FUNCIONAIS</w:t>
         <w:tab/>
-        <w:t>7</w:t>
+        <w:t>8</w:t>
       </w:r>
     </w:p>
     <w:p>
@@ -1850,7 +1850,7 @@
           <w:color w:val="000000"/>
           <w:sz w:val="22"/>
         </w:rPr>
-        <w:t>O caminho completo é: navegador → site (HTTPS) → repasse de /api/v1 → API → PostgreSQL, com a API enviando e-mails ao servidor SMTP.</w:t>
+        <w:t>O caminho completo é: navegador → site (HTTPS) → repasse de /api/v1 → API → PostgreSQL, com a API enviando e-mails pela API HTTPS da Brevo no ambiente integrado (o plano grátis do Render bloqueia SMTP) e pelo SMTP do Gmail no ambiente local.</w:t>
       </w:r>
     </w:p>
     <w:p>
@@ -4224,7 +4224,7 @@
                 <w:color w:val="000000"/>
                 <w:sz w:val="20"/>
               </w:rPr>
-              <w:t>Vercel (site), Render (API) e Neon (PostgreSQL)</w:t>
+              <w:t>Vercel (site), Render (API), Neon (PostgreSQL) e Brevo (e-mail)</w:t>
             </w:r>
           </w:p>
         </w:tc>
@@ -4268,7 +4268,7 @@
       <w:r>
         <w:drawing>
           <wp:inline>
-            <wp:extent cx="5760000" cy="2923243"/>
+            <wp:extent cx="5760000" cy="2917647"/>
             <wp:docPr id="1" name="Picture 1"/>
             <wp:cNvGraphicFramePr>
               <a:graphicFrameLocks noChangeAspect="1"/>
@@ -4289,7 +4289,7 @@
                   <pic:spPr>
                     <a:xfrm>
                       <a:off x="0" y="0"/>
-                      <a:ext cx="5760000" cy="2923243"/>
+                      <a:ext cx="5760000" cy="2917647"/>
                     </a:xfrm>
                     <a:prstGeom prst="rect"/>
                   </pic:spPr>
@@ -4990,6 +4990,86 @@
                 <w:sz w:val="20"/>
               </w:rPr>
               <w:t>Enviar dentro da requisição</w:t>
+            </w:r>
+          </w:p>
+        </w:tc>
+      </w:tr>
+      <w:tr>
+        <w:trPr>
+          <w:cantSplit w:val="1"/>
+        </w:trPr>
+        <w:tc>
+          <w:tcPr>
+            <w:tcW w:type="dxa" w:w="2948"/>
+            <w:tcMar>
+              <w:top w:w="60" w:type="dxa"/>
+              <w:left w:w="100" w:type="dxa"/>
+              <w:bottom w:w="60" w:type="dxa"/>
+              <w:right w:w="100" w:type="dxa"/>
+            </w:tcMar>
+          </w:tcPr>
+          <w:p>
+            <w:pPr>
+              <w:spacing w:before="0" w:after="40" w:line="260" w:lineRule="auto"/>
+            </w:pPr>
+            <w:r>
+              <w:rPr>
+                <w:rFonts w:ascii="Arial" w:hAnsi="Arial" w:eastAsia="Arial" w:cs="Arial"/>
+                <w:b w:val="0"/>
+                <w:color w:val="000000"/>
+                <w:sz w:val="20"/>
+              </w:rPr>
+              <w:t>E-mail pela API HTTPS da Brevo no Render</w:t>
+            </w:r>
+          </w:p>
+        </w:tc>
+        <w:tc>
+          <w:tcPr>
+            <w:tcW w:type="dxa" w:w="3628"/>
+            <w:tcMar>
+              <w:top w:w="60" w:type="dxa"/>
+              <w:left w:w="100" w:type="dxa"/>
+              <w:bottom w:w="60" w:type="dxa"/>
+              <w:right w:w="100" w:type="dxa"/>
+            </w:tcMar>
+          </w:tcPr>
+          <w:p>
+            <w:pPr>
+              <w:spacing w:before="0" w:after="40" w:line="260" w:lineRule="auto"/>
+            </w:pPr>
+            <w:r>
+              <w:rPr>
+                <w:rFonts w:ascii="Arial" w:hAnsi="Arial" w:eastAsia="Arial" w:cs="Arial"/>
+                <w:b w:val="0"/>
+                <w:color w:val="000000"/>
+                <w:sz w:val="20"/>
+              </w:rPr>
+              <w:t>O plano grátis do Render bloqueia as portas de SMTP (25, 465 e 587); HTTPS passa em qualquer hospedagem. Sem a chave, a API usa SMTP</w:t>
+            </w:r>
+          </w:p>
+        </w:tc>
+        <w:tc>
+          <w:tcPr>
+            <w:tcW w:type="dxa" w:w="2494"/>
+            <w:tcMar>
+              <w:top w:w="60" w:type="dxa"/>
+              <w:left w:w="100" w:type="dxa"/>
+              <w:bottom w:w="60" w:type="dxa"/>
+              <w:right w:w="100" w:type="dxa"/>
+            </w:tcMar>
+          </w:tcPr>
+          <w:p>
+            <w:pPr>
+              <w:spacing w:before="0" w:after="40" w:line="260" w:lineRule="auto"/>
+            </w:pPr>
+            <w:r>
+              <w:rPr>
+                <w:rFonts w:ascii="Arial" w:hAnsi="Arial" w:eastAsia="Arial" w:cs="Arial"/>
+                <w:b w:val="0"/>
+                <w:color w:val="000000"/>
+                <w:sz w:val="20"/>
+              </w:rPr>
+              <w:t>Gmail por SMTP direto; plano pago do Render</w:t>
             </w:r>
           </w:p>
         </w:tc>

</xml_diff>